<commit_message>
Add Benefits Management admin panel for sub-wallet system
- Benefits page with Bulk Load Panel (type, occasion, amount, user scope)
- Utilisation Dashboard with 4 metric cards and type-breakdown table
- AI Benefits Insight card using Claude Haiku for HR/Finance recommendations
- Sidebar: added Benefits menu item with GiftOutlined icon
- Route: /benefits

Co-Authored-By: Claude Opus 4.6 <noreply@anthropic.com>
</commit_message>
<xml_diff>
--- a/PPI_Wallet_Admin_Dashboard_Engineering_Brief.docx
+++ b/PPI_Wallet_Admin_Dashboard_Engineering_Brief.docx
@@ -40273,6 +40273,324 @@
           <w:szCs w:val="20"/>
         </w:rPr>
         <w:t xml:space="preserve">PAN log scrubber: transaction with PAN in metadata → assert PAN does not appear in any log output</w:t>
+      </w:r>
+    </w:p>
+    <w:p>
+      <w:pPr>
+        <w:pStyle w:val="Normal"/>
+      </w:pPr>
+      <w:r>
+        <w:t xml:space="preserve"/>
+      </w:r>
+    </w:p>
+    <w:p>
+      <w:pPr>
+        <w:pStyle w:val="Normal"/>
+      </w:pPr>
+      <w:r>
+        <w:t xml:space="preserve"/>
+      </w:r>
+    </w:p>
+    <w:p>
+      <w:pPr>
+        <w:pStyle w:val="Heading2"/>
+      </w:pPr>
+      <w:r>
+        <w:rPr>
+          <w:b/>
+        </w:rPr>
+        <w:t xml:space="preserve">7.  MCP &amp; AI Agent Implementation (April 2026)</w:t>
+      </w:r>
+    </w:p>
+    <w:p>
+      <w:pPr>
+        <w:pStyle w:val="Normal"/>
+      </w:pPr>
+      <w:r>
+        <w:t xml:space="preserve"/>
+      </w:r>
+    </w:p>
+    <w:p>
+      <w:pPr>
+        <w:pStyle w:val="Normal"/>
+      </w:pPr>
+      <w:r>
+        <w:t xml:space="preserve">The following components have been implemented as a functional prototype / demo layer, running alongside the planned production architecture above:</w:t>
+      </w:r>
+    </w:p>
+    <w:p>
+      <w:pPr>
+        <w:pStyle w:val="Normal"/>
+      </w:pPr>
+      <w:r>
+        <w:t xml:space="preserve"/>
+      </w:r>
+    </w:p>
+    <w:p>
+      <w:pPr>
+        <w:pStyle w:val="Heading3"/>
+      </w:pPr>
+      <w:r>
+        <w:rPr>
+          <w:b/>
+        </w:rPr>
+        <w:t>7.1  MCP Server (35 Tools)</w:t>
+      </w:r>
+    </w:p>
+    <w:p>
+      <w:pPr>
+        <w:pStyle w:val="Normal"/>
+      </w:pPr>
+      <w:r>
+        <w:t>A Model Context Protocol server (wallet-mcp-server.js) exposes 35 tools to Claude Desktop and other MCP clients. Tools are organized into 9 categories: User &amp; Wallet (10), Admin &amp; Platform (6), Transaction Operations (5), Compliance (1), Disputes &amp; Support (3), Notifications (2), KYC Actions (3), Analytics (2), KYC Expiry &amp; Renewal (2). All tools use Zod schema validation and route to mock-data.js functions.</w:t>
+      </w:r>
+    </w:p>
+    <w:p>
+      <w:pPr>
+        <w:pStyle w:val="Normal"/>
+      </w:pPr>
+      <w:r>
+        <w:t xml:space="preserve"/>
+      </w:r>
+    </w:p>
+    <w:p>
+      <w:pPr>
+        <w:pStyle w:val="Normal"/>
+      </w:pPr>
+      <w:r>
+        <w:t xml:space="preserve">7.2  KYC Expiry Alert Service</w:t>
+      </w:r>
+    </w:p>
+    <w:p>
+      <w:pPr>
+        <w:pStyle w:val="Normal"/>
+      </w:pPr>
+      <w:r>
+        <w:t xml:space="preserve">An automated KYC alert engine (mcp/services/kyc-alert-service.js) integrated into the admin dashboard via KycAlertPanel.tsx on the KYC Management page. Uses Claude Haiku for cost-effective AI message generation. Endpoints: GET /api/kyc-alerts/preview, POST /api/kyc-alerts/run. Optional daily scheduler via node-cron at 9:00 AM IST.</w:t>
+      </w:r>
+    </w:p>
+    <w:p>
+      <w:pPr>
+        <w:pStyle w:val="Normal"/>
+      </w:pPr>
+      <w:r>
+        <w:t xml:space="preserve"/>
+      </w:r>
+    </w:p>
+    <w:p>
+      <w:pPr>
+        <w:pStyle w:val="Heading3"/>
+      </w:pPr>
+      <w:r>
+        <w:rPr>
+          <w:b/>
+        </w:rPr>
+        <w:t xml:space="preserve">7.2  Mock Data Layer (200 Users)</w:t>
+      </w:r>
+    </w:p>
+    <w:p>
+      <w:pPr>
+        <w:pStyle w:val="Normal"/>
+      </w:pPr>
+      <w:r>
+        <w:t xml:space="preserve">mock-data.js serves as the single source of truth for the demo ecosystem: 200 users generated via seeded PRNG (seed=100), 500+ transactions (seed=200), 41 exported functions, BigInt paise arithmetic throughout, RBI PPI limits enforced, 23 merchant categories, disputes/refunds/notifications arrays, KYC expiry tracking with urgency bands.</w:t>
+      </w:r>
+    </w:p>
+    <w:p>
+      <w:pPr/>
+      <w:r>
+        <w:rPr>
+          <w:b/>
+        </w:rPr>
+        <w:t>Wallet Load Guard Service &amp; Admin Panel</w:t>
+      </w:r>
+    </w:p>
+    <w:p>
+      <w:pPr/>
+      <w:r>
+        <w:t>Wallet Load Guard — RBI PPI Limit Validation</w:t>
+      </w:r>
+    </w:p>
+    <w:p>
+      <w:pPr/>
+    </w:p>
+    <w:p>
+      <w:pPr/>
+      <w:r>
+        <w:t>The Wallet Load Guard is a pre-transaction validation layer that enforces RBI PPI limits before any wallet load (add money) transaction is processed.</w:t>
+      </w:r>
+    </w:p>
+    <w:p>
+      <w:pPr/>
+    </w:p>
+    <w:p>
+      <w:pPr/>
+      <w:r>
+        <w:t>Three RBI Rules Validated:</w:t>
+      </w:r>
+    </w:p>
+    <w:p>
+      <w:pPr/>
+      <w:r>
+        <w:t>1. BALANCE_CAP — Maximum wallet balance of ₹1,00,000</w:t>
+      </w:r>
+    </w:p>
+    <w:p>
+      <w:pPr/>
+      <w:r>
+        <w:t>2. MONTHLY_LOAD — Maximum ₹2,00,000 total loads per calendar month</w:t>
+      </w:r>
+    </w:p>
+    <w:p>
+      <w:pPr/>
+      <w:r>
+        <w:t>3. MIN_KYC_CAP — Maximum ₹10,000 balance for Minimum KYC users</w:t>
+      </w:r>
+    </w:p>
+    <w:p>
+      <w:pPr/>
+    </w:p>
+    <w:p>
+      <w:pPr/>
+      <w:r>
+        <w:t>Architecture:</w:t>
+      </w:r>
+    </w:p>
+    <w:p>
+      <w:pPr/>
+      <w:r>
+        <w:t>- Backend: mcp/services/wallet-load-guard.js — validation + Claude Haiku messages</w:t>
+      </w:r>
+    </w:p>
+    <w:p>
+      <w:pPr/>
+      <w:r>
+        <w:t>- API: POST /api/wallet/validate-load, GET /api/wallet/load-guard-log</w:t>
+      </w:r>
+    </w:p>
+    <w:p>
+      <w:pPr/>
+      <w:r>
+        <w:t>- UI: Add Money page with live helper text, block alerts, "Add max instead" button</w:t>
+      </w:r>
+    </w:p>
+    <w:p>
+      <w:pPr/>
+      <w:r>
+        <w:t>- Admin: Load Guard Log panel on Dashboard (last 10 blocked attempts)</w:t>
+      </w:r>
+    </w:p>
+    <w:p>
+      <w:pPr>
+        <w:pStyle w:val="Normal"/>
+      </w:pPr>
+      <w:r>
+        <w:t xml:space="preserve"/>
+      </w:r>
+    </w:p>
+    <w:p>
+      <w:pPr>
+        <w:pStyle w:val="Heading3"/>
+      </w:pPr>
+      <w:r>
+        <w:rPr>
+          <w:b/>
+        </w:rPr>
+        <w:t xml:space="preserve">7.3  Render Backend (13 Endpoints)</w:t>
+      </w:r>
+    </w:p>
+    <w:p>
+      <w:pPr>
+        <w:pStyle w:val="Normal"/>
+      </w:pPr>
+      <w:r>
+        <w:t xml:space="preserve">Express.js server at ppi-wallet-api.onrender.com serves MCP data to GitHub Pages frontends. Endpoints include: GET /api/users (paginated), GET /api/users/:userId (detail), GET /api/transactions (paginated), GET /api/overview (analytics), GET /api/kyc/stats, GET /api/kyc/queue, GET /api/wallet/balance/:walletId, GET /api/wallet/ledger/:walletId, GET /api/wallet/status/:walletId, POST /api/wallet/transact (sync), POST /api/chat (AI), POST /api/summarise-transactions (AI summarizer).</w:t>
+      </w:r>
+    </w:p>
+    <w:p>
+      <w:pPr>
+        <w:pStyle w:val="Normal"/>
+      </w:pPr>
+      <w:r>
+        <w:t xml:space="preserve"/>
+      </w:r>
+    </w:p>
+    <w:p>
+      <w:pPr>
+        <w:pStyle w:val="Heading3"/>
+      </w:pPr>
+      <w:r>
+        <w:rPr>
+          <w:b/>
+        </w:rPr>
+        <w:t xml:space="preserve">7.4  Transaction Sync</w:t>
+      </w:r>
+    </w:p>
+    <w:p>
+      <w:pPr>
+        <w:pStyle w:val="Normal"/>
+      </w:pPr>
+      <w:r>
+        <w:t xml:space="preserve">Wallet app sync.ts pushes transaction events to the Render backend (POST /api/wallet/transact), which executes them against mock-data.js in memory. This ensures AI agent queries return up-to-date data. The sync covers: ADD_MONEY, MERCHANT_PAY, P2P_TRANSFER, BILL_PAY saga types.</w:t>
+      </w:r>
+    </w:p>
+    <w:p>
+      <w:pPr>
+        <w:pStyle w:val="Normal"/>
+      </w:pPr>
+      <w:r>
+        <w:t xml:space="preserve"/>
+      </w:r>
+    </w:p>
+    <w:p>
+      <w:pPr>
+        <w:pStyle w:val="Heading3"/>
+      </w:pPr>
+      <w:r>
+        <w:rPr>
+          <w:b/>
+        </w:rPr>
+        <w:t xml:space="preserve">7.5  Deployment</w:t>
+      </w:r>
+    </w:p>
+    <w:p>
+      <w:pPr>
+        <w:pStyle w:val="Normal"/>
+      </w:pPr>
+      <w:r>
+        <w:t xml:space="preserve">Wallet App: GitHub Pages (gaurav2sheth.github.io/paytm-wallet-app)</w:t>
+      </w:r>
+    </w:p>
+    <w:p>
+      <w:pPr>
+        <w:pStyle w:val="Normal"/>
+      </w:pPr>
+      <w:r>
+        <w:t xml:space="preserve">Admin Dashboard: GitHub Pages (gaurav2sheth.github.io/ppi-wallet-admin)</w:t>
+      </w:r>
+    </w:p>
+    <w:p>
+      <w:pPr>
+        <w:pStyle w:val="Normal"/>
+      </w:pPr>
+      <w:r>
+        <w:t xml:space="preserve">Backend API: Render (ppi-wallet-api.onrender.com) — auto-deploy from GitHub</w:t>
+      </w:r>
+    </w:p>
+    <w:p>
+      <w:pPr>
+        <w:pStyle w:val="Normal"/>
+      </w:pPr>
+      <w:r>
+        <w:t xml:space="preserve">MCP Server: Local via Claude Desktop configuration (stdio transport)</w:t>
+      </w:r>
+    </w:p>
+    <w:p>
+      <w:pPr>
+        <w:pStyle w:val="Normal"/>
+      </w:pPr>
+      <w:r>
+        <w:t xml:space="preserve">Repositories: paytm-wallet-app, ppi-wallet-admin, ppi-wallet-api, ppi-wallet-mcp</w:t>
       </w:r>
     </w:p>
     <w:p>

</xml_diff>